<commit_message>
formatting tweaks for PNAS
</commit_message>
<xml_diff>
--- a/reference.docx
+++ b/reference.docx
@@ -783,11 +783,11 @@
     <w:uiPriority w:val="9"/>
     <w:unhideWhenUsed/>
     <w:qFormat/>
-    <w:rsid w:val="0000020F"/>
+    <w:rsid w:val="00D6041C"/>
     <w:pPr>
       <w:keepNext/>
       <w:keepLines/>
-      <w:spacing w:before="200" w:after="0"/>
+      <w:spacing w:before="360" w:after="0"/>
       <w:outlineLvl w:val="1"/>
     </w:pPr>
     <w:rPr>
@@ -806,11 +806,11 @@
     <w:uiPriority w:val="9"/>
     <w:unhideWhenUsed/>
     <w:qFormat/>
-    <w:rsid w:val="0000020F"/>
+    <w:rsid w:val="00D6041C"/>
     <w:pPr>
       <w:keepNext/>
       <w:keepLines/>
-      <w:spacing w:before="200" w:after="0"/>
+      <w:spacing w:before="360" w:after="0"/>
       <w:outlineLvl w:val="2"/>
     </w:pPr>
     <w:rPr>

</xml_diff>